<commit_message>
Overview: preparer line removed per Adam
Co-Authored-By: Claude Fable 5 <noreply@anthropic.com>
</commit_message>
<xml_diff>
--- a/docs/APP_FUNCTIONS_AND_DESIGN.docx
+++ b/docs/APP_FUNCTIONS_AND_DESIGN.docx
@@ -18,32 +18,6 @@
       </w:pPr>
       <w:r>
         <w:t xml:space="preserve">A Complete Overview: Every Function, Its Design, and the Vision Ahead</w:t>
-      </w:r>
-    </w:p>
-    <w:p>
-      <w:pPr>
-        <w:pStyle w:val="FirstParagraph"/>
-      </w:pPr>
-      <w:r>
-        <w:rPr>
-          <w:i/>
-          <w:iCs/>
-        </w:rPr>
-        <w:t xml:space="preserve">Prepared August 2026 for Holy Geshe Michael Roach and the Director of</w:t>
-      </w:r>
-      <w:r>
-        <w:rPr>
-          <w:i/>
-          <w:iCs/>
-        </w:rPr>
-        <w:t xml:space="preserve"> </w:t>
-      </w:r>
-      <w:r>
-        <w:rPr>
-          <w:i/>
-          <w:iCs/>
-        </w:rPr>
-        <w:t xml:space="preserve">the Asian Legacy Library, at the request of Adam Andrade.</w:t>
       </w:r>
     </w:p>
     <w:p>

</xml_diff>

<commit_message>
Pending-count badge + leadership docs refreshed to fifteen panes
- Approval tab: the authority sees the pending count on the tab label
  ("Approval (3)"), updated live after each ruling.
- The leadership overview (md + styled docx + the manuscript artifact)
  now describes all fifteen panes — Review, Propose, and Approval
  added, panes renumbered 1-15, suite count 37. docs/
  APP_FUNCTIONS_AND_DESIGN regenerated by a new reusable generator
  (tools/build_overview_docx.py — parses the markdown so the styled
  docx always tracks the source, no more hand-maintained content).
- White paper pane count corrected to fifteen; docx regenerated.

37/37 suites green; app launch-verified.

Co-Authored-By: Claude Fable 5 <noreply@anthropic.com>
</commit_message>
<xml_diff>
--- a/docs/APP_FUNCTIONS_AND_DESIGN.docx
+++ b/docs/APP_FUNCTIONS_AND_DESIGN.docx
@@ -5,30 +5,7 @@
   <w:body>
     <w:p>
       <w:pPr>
-        <w:spacing w:after="600"/>
-      </w:pPr>
-    </w:p>
-    <w:p>
-      <w:pPr>
-        <w:spacing w:before="1200" w:after="280"/>
-        <w:jc w:val="center"/>
-      </w:pPr>
-      <w:r>
-        <w:rPr>
-          <w:rFonts w:ascii="Helvetica Neue" w:hAnsi="Helvetica Neue"/>
-          <w:b/>
-          <w:i w:val="0"/>
-          <w:color w:val="9A7A33"/>
-          <w:sz w:val="16"/>
-          <w:caps w:val="1"/>
-          <w:spacing w:val="28"/>
-        </w:rPr>
-        <w:t>Asian Legacy Library · Asian Classics Input Project</w:t>
-      </w:r>
-    </w:p>
-    <w:p>
-      <w:pPr>
-        <w:spacing w:after="120"/>
+        <w:spacing w:before="800" w:after="80"/>
         <w:jc w:val="center"/>
       </w:pPr>
       <w:r>
@@ -44,7 +21,7 @@
     </w:p>
     <w:p>
       <w:pPr>
-        <w:spacing w:after="480"/>
+        <w:spacing w:before="0" w:after="400"/>
         <w:jc w:val="center"/>
       </w:pPr>
       <w:r>
@@ -159,18 +136,25 @@
     </w:p>
     <w:p>
       <w:pPr>
-        <w:pBdr>
-          <w:left w:val="single" w:sz="18" w:space="12" w:color="8C2F2B"/>
-        </w:pBdr>
-        <w:ind w:left="259"/>
+        <w:spacing w:before="0" w:after="120"/>
+        <w:ind w:left="432" w:hanging="432"/>
       </w:pPr>
       <w:r>
         <w:rPr>
           <w:rFonts w:ascii="Palatino" w:hAnsi="Palatino"/>
           <w:b/>
           <w:i w:val="0"/>
+          <w:color w:val="9A7A33"/>
         </w:rPr>
-        <w:t>1. Geshe Michael's English is the binding layer.</w:t>
+        <w:t xml:space="preserve">1.  </w:t>
+      </w:r>
+      <w:r>
+        <w:rPr>
+          <w:rFonts w:ascii="Palatino" w:hAnsi="Palatino"/>
+          <w:b/>
+          <w:i w:val="0"/>
+        </w:rPr>
+        <w:t>Geshe Michael's English is the binding layer.</w:t>
       </w:r>
       <w:r>
         <w:rPr>
@@ -199,18 +183,25 @@
     </w:p>
     <w:p>
       <w:pPr>
-        <w:pBdr>
-          <w:left w:val="single" w:sz="18" w:space="12" w:color="8C2F2B"/>
-        </w:pBdr>
-        <w:ind w:left="259"/>
+        <w:spacing w:before="0" w:after="120"/>
+        <w:ind w:left="432" w:hanging="432"/>
       </w:pPr>
       <w:r>
         <w:rPr>
           <w:rFonts w:ascii="Palatino" w:hAnsi="Palatino"/>
           <w:b/>
           <w:i w:val="0"/>
+          <w:color w:val="9A7A33"/>
         </w:rPr>
-        <w:t>2. The tool never guesses.</w:t>
+        <w:t xml:space="preserve">2.  </w:t>
+      </w:r>
+      <w:r>
+        <w:rPr>
+          <w:rFonts w:ascii="Palatino" w:hAnsi="Palatino"/>
+          <w:b/>
+          <w:i w:val="0"/>
+        </w:rPr>
+        <w:t>The tool never guesses.</w:t>
       </w:r>
       <w:r>
         <w:rPr>
@@ -239,18 +230,25 @@
     </w:p>
     <w:p>
       <w:pPr>
-        <w:pBdr>
-          <w:left w:val="single" w:sz="18" w:space="12" w:color="8C2F2B"/>
-        </w:pBdr>
-        <w:ind w:left="259"/>
+        <w:spacing w:before="0" w:after="120"/>
+        <w:ind w:left="432" w:hanging="432"/>
       </w:pPr>
       <w:r>
         <w:rPr>
           <w:rFonts w:ascii="Palatino" w:hAnsi="Palatino"/>
           <w:b/>
           <w:i w:val="0"/>
+          <w:color w:val="9A7A33"/>
         </w:rPr>
-        <w:t>3. Work performed once is never redone.</w:t>
+        <w:t xml:space="preserve">3.  </w:t>
+      </w:r>
+      <w:r>
+        <w:rPr>
+          <w:rFonts w:ascii="Palatino" w:hAnsi="Palatino"/>
+          <w:b/>
+          <w:i w:val="0"/>
+        </w:rPr>
+        <w:t>Work performed once is never redone.</w:t>
       </w:r>
       <w:r>
         <w:rPr>
@@ -263,62 +261,7 @@
     </w:p>
     <w:p>
       <w:pPr>
-        <w:spacing w:before="360" w:after="360"/>
-        <w:jc w:val="center"/>
-      </w:pPr>
-      <w:r>
-        <w:rPr>
-          <w:rFonts w:ascii="Palatino" w:hAnsi="Palatino"/>
-          <w:b w:val="0"/>
-          <w:i w:val="0"/>
-          <w:color w:val="C9B992"/>
-          <w:sz w:val="18"/>
-        </w:rPr>
-        <w:t xml:space="preserve">──────────────────────  </w:t>
-      </w:r>
-      <w:r>
-        <w:rPr>
-          <w:rFonts w:ascii="Palatino" w:hAnsi="Palatino"/>
-          <w:b w:val="0"/>
-          <w:i w:val="0"/>
-          <w:color w:val="9A7A33"/>
-          <w:sz w:val="18"/>
-        </w:rPr>
-        <w:t>❖</w:t>
-      </w:r>
-      <w:r>
-        <w:rPr>
-          <w:rFonts w:ascii="Palatino" w:hAnsi="Palatino"/>
-          <w:b w:val="0"/>
-          <w:i w:val="0"/>
-          <w:color w:val="C9B992"/>
-          <w:sz w:val="18"/>
-        </w:rPr>
-        <w:t xml:space="preserve">  ──────────────────────</w:t>
-      </w:r>
-    </w:p>
-    <w:p>
-      <w:pPr>
-        <w:spacing w:before="120" w:after="80"/>
-        <w:jc w:val="center"/>
-      </w:pPr>
-      <w:r>
-        <w:rPr>
-          <w:rFonts w:ascii="Helvetica Neue" w:hAnsi="Helvetica Neue"/>
-          <w:b/>
-          <w:i w:val="0"/>
-          <w:color w:val="9A7A33"/>
-          <w:sz w:val="16"/>
-          <w:caps w:val="1"/>
-          <w:spacing w:val="28"/>
-        </w:rPr>
-        <w:t>Part I</w:t>
-      </w:r>
-    </w:p>
-    <w:p>
-      <w:pPr>
-        <w:keepNext/>
-        <w:spacing w:before="40" w:after="240"/>
+        <w:spacing w:before="800" w:after="80"/>
         <w:jc w:val="center"/>
       </w:pPr>
       <w:r>
@@ -326,10 +269,10 @@
           <w:rFonts w:ascii="Palatino" w:hAnsi="Palatino"/>
           <w:b/>
           <w:i w:val="0"/>
-          <w:color w:val="2B2118"/>
-          <w:sz w:val="32"/>
+          <w:color w:val="8C2F2B"/>
+          <w:sz w:val="52"/>
         </w:rPr>
-        <w:t>Every Function the Application Provides</w:t>
+        <w:t>PART I — EVERY FUNCTION THE APPLICATION PROVIDES</w:t>
       </w:r>
     </w:p>
     <w:p>
@@ -339,7 +282,7 @@
           <w:b w:val="0"/>
           <w:i w:val="0"/>
         </w:rPr>
-        <w:t>The application is one window with twelve working areas (“panes”), built on one shared core. Everything except two clearly-marked AI features runs fully offline — a deliberate choice, so that the tool serves equally in New York, in a monastery library, or at an input center with no reliable connection.</w:t>
+        <w:t>The application is one window with fifteen working areas ("panes") — fourteen for everyone, and one more that appears only for an authority (described last) — built on one shared core. Everything except two clearly-marked AI features runs fully offline — a deliberate choice, so that the tool serves equally in New York, in a monastery library, or at an input center with no reliable connection.</w:t>
       </w:r>
     </w:p>
     <w:p>
@@ -417,7 +360,7 @@
           <w:b w:val="0"/>
           <w:i w:val="0"/>
         </w:rPr>
-        <w:t>); the honorific badge with the ordinary counterpart shown beside; the community pronunciations of the term (“also heard”); the translator's own per-text glossary, editable in place; and curated links out to the major online resources (84000, BDRC, Bibliotheca Polyglotta, Lotsawa House).</w:t>
+        <w:t>); the honorific badge with the ordinary counterpart shown beside; the community pronunciations of the term ("also heard"); the translator's own per-text glossary, editable in place; and curated links out to the major online resources (84000, BDRC, Bibliotheca Polyglotta, Lotsawa House).</w:t>
       </w:r>
     </w:p>
     <w:p>
@@ -717,7 +660,7 @@
           <w:b w:val="0"/>
           <w:i w:val="0"/>
         </w:rPr>
-        <w:t>: every footnote (344) and bibliography entry (138) from the released Mixed Nuts volumes, searchable and insertable with citation attached; a bibliography composer in the exact house format, filling itself in from the Project's catalog for over 1,800 known works; and quotation detection — when the text being translated quotes a work in the corpus, the app finds the quotation, shows the published rendering of those very lines, and offers the published citation and any published footnotes on that passage. Notes a translator proposes wait in a clearly-marked pending queue; there is deliberately no “approve” button in the software, because approval belongs to the publishing process, not the tool. An optional AI back-check produces a coverage report only — omissions and additions — and is forbidden by construction to retranslate.</w:t>
+        <w:t>: every footnote (344) and bibliography entry (138) from the released Mixed Nuts volumes, searchable and insertable with citation attached; a bibliography composer in the exact house format, filling itself in from the Project's catalog for over 1,800 known works; and quotation detection — when the text being translated quotes a work in the corpus, the app finds the quotation, shows the published rendering of those very lines, and offers the published citation and any published footnotes on that passage. Notes a translator proposes wait in a clearly-marked pending queue; there is deliberately no "approve" button in the software, because approval belongs to the publishing process, not the tool. An optional AI back-check produces a coverage report only — omissions and additions — and is forbidden by construction to retranslate.</w:t>
       </w:r>
     </w:p>
     <w:p>
@@ -734,6 +677,42 @@
           <w:sz w:val="26"/>
         </w:rPr>
         <w:t xml:space="preserve">6  </w:t>
+      </w:r>
+      <w:r>
+        <w:rPr>
+          <w:rFonts w:ascii="Palatino" w:hAnsi="Palatino"/>
+          <w:b/>
+          <w:i w:val="0"/>
+          <w:color w:val="8C2F2B"/>
+          <w:sz w:val="26"/>
+        </w:rPr>
+        <w:t>Review — the overseer's bench</w:t>
+      </w:r>
+    </w:p>
+    <w:p>
+      <w:r>
+        <w:rPr>
+          <w:rFonts w:ascii="Palatino" w:hAnsi="Palatino"/>
+          <w:b w:val="0"/>
+          <w:i w:val="0"/>
+        </w:rPr>
+        <w:t>Where Draft serves the translator, Review serves the senior translator who checks another's work. The Tibetan source and the finished English draft sit side by side, and one button produces a reviewer's report that guides attention without ever issuing a verdict: terms whose established senses differ by register (a warning to confirm the rendering fits this text's register); renderings that rest on provisional-tier glosses; source terms none of whose established equivalents appear in the draft (which may be a deliberate choice — worth a look); one English word serving two different Tibetan terms (a distinction may have collapsed); and terms carrying three or more established senses, asking the reviewer to confirm the one chosen. Rule one holds here as everywhere: the checker only matches against Geshe Michael's own glosses; it never composes English.</w:t>
+      </w:r>
+    </w:p>
+    <w:p>
+      <w:pPr>
+        <w:keepNext/>
+        <w:spacing w:before="280" w:after="100"/>
+      </w:pPr>
+      <w:r>
+        <w:rPr>
+          <w:rFonts w:ascii="Palatino" w:hAnsi="Palatino"/>
+          <w:b w:val="0"/>
+          <w:i w:val="0"/>
+          <w:color w:val="9A7A33"/>
+          <w:sz w:val="26"/>
+        </w:rPr>
+        <w:t xml:space="preserve">7  </w:t>
       </w:r>
       <w:r>
         <w:rPr>
@@ -769,7 +748,7 @@
           <w:color w:val="9A7A33"/>
           <w:sz w:val="26"/>
         </w:rPr>
-        <w:t xml:space="preserve">7  </w:t>
+        <w:t xml:space="preserve">8  </w:t>
       </w:r>
       <w:r>
         <w:rPr>
@@ -815,7 +794,7 @@
           <w:color w:val="9A7A33"/>
           <w:sz w:val="26"/>
         </w:rPr>
-        <w:t xml:space="preserve">8  </w:t>
+        <w:t xml:space="preserve">9  </w:t>
       </w:r>
       <w:r>
         <w:rPr>
@@ -851,7 +830,7 @@
           <w:color w:val="9A7A33"/>
           <w:sz w:val="26"/>
         </w:rPr>
-        <w:t xml:space="preserve">9  </w:t>
+        <w:t xml:space="preserve">10  </w:t>
       </w:r>
       <w:r>
         <w:rPr>
@@ -903,7 +882,7 @@
           <w:color w:val="9A7A33"/>
           <w:sz w:val="26"/>
         </w:rPr>
-        <w:t xml:space="preserve">10  </w:t>
+        <w:t xml:space="preserve">11  </w:t>
       </w:r>
       <w:r>
         <w:rPr>
@@ -939,7 +918,7 @@
           <w:color w:val="9A7A33"/>
           <w:sz w:val="26"/>
         </w:rPr>
-        <w:t xml:space="preserve">11  </w:t>
+        <w:t xml:space="preserve">12  </w:t>
       </w:r>
       <w:r>
         <w:rPr>
@@ -1007,7 +986,7 @@
           <w:b w:val="0"/>
           <w:i w:val="0"/>
         </w:rPr>
-        <w:t xml:space="preserve">, so a student who knows only “gonpa” or “tulku” still arrives at the entry — with the strict convention shown beside, so the register teaches rather than replaces; English-to-Tibetan reverse lookup; and, for Sanskrit, the two preeminent works of William Dwight Whitney integrated whole — all 937 roots of the 1885 </w:t>
+        <w:t xml:space="preserve">, so a student who knows only "gonpa" or "tulku" still arrives at the entry — with the strict convention shown beside, so the register teaches rather than replaces; English-to- Tibetan reverse lookup; and, for Sanskrit, the two preeminent works of William Dwight Whitney integrated whole — all 937 roots of the 1885 </w:t>
       </w:r>
       <w:r>
         <w:rPr>
@@ -1055,7 +1034,7 @@
           <w:color w:val="9A7A33"/>
           <w:sz w:val="26"/>
         </w:rPr>
-        <w:t xml:space="preserve">12  </w:t>
+        <w:t xml:space="preserve">13  </w:t>
       </w:r>
       <w:r>
         <w:rPr>
@@ -1076,6 +1055,78 @@
           <w:i w:val="0"/>
         </w:rPr>
         <w:t>Text recognition runs inside the application: the Buddhist Digital Resource Center's open models (used with BDRC's permission, credited wherever output appears), with both the line detector and the recognizer proven line-for-line against BDRC's own program running beside them. A page scan opens; its lines are found and read; every line appears in transliteration and Tibetan script with an immediate quality check that counts and marks every syllable failing the classical legality rules. Every recognized word knows its exact position on the page — click a word in the reading and it lights up on the woodblock. A whole scanned volume processes in one batch. And the Project's discipline governs all of it: OCR output is tagged unverified review material, is never smoothed, and never enters the corpus.</w:t>
+      </w:r>
+    </w:p>
+    <w:p>
+      <w:pPr>
+        <w:keepNext/>
+        <w:spacing w:before="280" w:after="100"/>
+      </w:pPr>
+      <w:r>
+        <w:rPr>
+          <w:rFonts w:ascii="Palatino" w:hAnsi="Palatino"/>
+          <w:b w:val="0"/>
+          <w:i w:val="0"/>
+          <w:color w:val="9A7A33"/>
+          <w:sz w:val="26"/>
+        </w:rPr>
+        <w:t xml:space="preserve">14  </w:t>
+      </w:r>
+      <w:r>
+        <w:rPr>
+          <w:rFonts w:ascii="Palatino" w:hAnsi="Palatino"/>
+          <w:b/>
+          <w:i w:val="0"/>
+          <w:color w:val="8C2F2B"/>
+          <w:sz w:val="26"/>
+        </w:rPr>
+        <w:t>Propose — offering terms to the authority</w:t>
+      </w:r>
+    </w:p>
+    <w:p>
+      <w:r>
+        <w:rPr>
+          <w:rFonts w:ascii="Palatino" w:hAnsi="Palatino"/>
+          <w:b w:val="0"/>
+          <w:i w:val="0"/>
+        </w:rPr>
+        <w:t>Every team member can propose. While reading, the card for any word carries a quiet "propose to the authority" action, and a dedicated Propose pane offers the same by form: an honorific or high-honorific word or verb, a pronunciation exception, an abbreviation candidate, a rendering for a word or phrase, or a note about a passage. The proposal is filed with its evidence — the surrounding passage is captured automatically — and the proposer's name, recorded for provenance. This is deliberately not a login: a name and role set once, so that within a trusted in-house team the attribution and the audit trail are honest, without accounts or a server. The proposals live as small files in a shared folder — pointed at the Project's own Dropbox, the whole team's queue synchronizes with no infrastructure, offline-capable and fully traceable.</w:t>
+      </w:r>
+    </w:p>
+    <w:p>
+      <w:pPr>
+        <w:keepNext/>
+        <w:spacing w:before="280" w:after="100"/>
+      </w:pPr>
+      <w:r>
+        <w:rPr>
+          <w:rFonts w:ascii="Palatino" w:hAnsi="Palatino"/>
+          <w:b w:val="0"/>
+          <w:i w:val="0"/>
+          <w:color w:val="9A7A33"/>
+          <w:sz w:val="26"/>
+        </w:rPr>
+        <w:t xml:space="preserve">15  </w:t>
+      </w:r>
+      <w:r>
+        <w:rPr>
+          <w:rFonts w:ascii="Palatino" w:hAnsi="Palatino"/>
+          <w:b/>
+          <w:i w:val="0"/>
+          <w:color w:val="8C2F2B"/>
+          <w:sz w:val="26"/>
+        </w:rPr>
+        <w:t>Approval — the authority's queue</w:t>
+      </w:r>
+    </w:p>
+    <w:p>
+      <w:r>
+        <w:rPr>
+          <w:rFonts w:ascii="Palatino" w:hAnsi="Palatino"/>
+          <w:b w:val="0"/>
+          <w:i w:val="0"/>
+        </w:rPr>
+        <w:t>This pane appears only for an authority — Geshe Michael, or Adam as a second administrator. It shows the pending proposals, each with its evidence and its proposer, and offers three rulings: approve, decline, or defer, with an optional note; the tab itself carries a count so a growing queue is visible at a glance. The boundary that protects the data is enforced here in the software itself. Register proposals — honorific, high-honorific, pronunciation, abbreviation — apply in the application the moment they are approved, written into the register with the approved tier and a record of who approved them and when. Dictionary and corpus proposals — renderings and notes — are approved in the same way but are never written into the corpus by the app; instead the authority exports them as a signed package of approved candidates for the data project to weigh into the next release. Same effortless approval; the master data keeps its single pipeline, and every ruling is preserved — over the years, a record of the authority's own judgments.</w:t>
       </w:r>
     </w:p>
     <w:p>
@@ -1207,7 +1258,7 @@
           <w:b/>
           <w:i w:val="0"/>
         </w:rPr>
-        <w:t>Thirty-six automated test batteries</w:t>
+        <w:t>Thirty-seven automated test batteries</w:t>
       </w:r>
       <w:r>
         <w:rPr>
@@ -1220,62 +1271,7 @@
     </w:p>
     <w:p>
       <w:pPr>
-        <w:spacing w:before="360" w:after="360"/>
-        <w:jc w:val="center"/>
-      </w:pPr>
-      <w:r>
-        <w:rPr>
-          <w:rFonts w:ascii="Palatino" w:hAnsi="Palatino"/>
-          <w:b w:val="0"/>
-          <w:i w:val="0"/>
-          <w:color w:val="C9B992"/>
-          <w:sz w:val="18"/>
-        </w:rPr>
-        <w:t xml:space="preserve">──────────────────────  </w:t>
-      </w:r>
-      <w:r>
-        <w:rPr>
-          <w:rFonts w:ascii="Palatino" w:hAnsi="Palatino"/>
-          <w:b w:val="0"/>
-          <w:i w:val="0"/>
-          <w:color w:val="9A7A33"/>
-          <w:sz w:val="18"/>
-        </w:rPr>
-        <w:t>❖</w:t>
-      </w:r>
-      <w:r>
-        <w:rPr>
-          <w:rFonts w:ascii="Palatino" w:hAnsi="Palatino"/>
-          <w:b w:val="0"/>
-          <w:i w:val="0"/>
-          <w:color w:val="C9B992"/>
-          <w:sz w:val="18"/>
-        </w:rPr>
-        <w:t xml:space="preserve">  ──────────────────────</w:t>
-      </w:r>
-    </w:p>
-    <w:p>
-      <w:pPr>
-        <w:spacing w:before="120" w:after="80"/>
-        <w:jc w:val="center"/>
-      </w:pPr>
-      <w:r>
-        <w:rPr>
-          <w:rFonts w:ascii="Helvetica Neue" w:hAnsi="Helvetica Neue"/>
-          <w:b/>
-          <w:i w:val="0"/>
-          <w:color w:val="9A7A33"/>
-          <w:sz w:val="16"/>
-          <w:caps w:val="1"/>
-          <w:spacing w:val="28"/>
-        </w:rPr>
-        <w:t>Part II</w:t>
-      </w:r>
-    </w:p>
-    <w:p>
-      <w:pPr>
-        <w:keepNext/>
-        <w:spacing w:before="40" w:after="240"/>
+        <w:spacing w:before="800" w:after="80"/>
         <w:jc w:val="center"/>
       </w:pPr>
       <w:r>
@@ -1283,10 +1279,26 @@
           <w:rFonts w:ascii="Palatino" w:hAnsi="Palatino"/>
           <w:b/>
           <w:i w:val="0"/>
-          <w:color w:val="2B2118"/>
-          <w:sz w:val="32"/>
+          <w:color w:val="8C2F2B"/>
+          <w:sz w:val="52"/>
         </w:rPr>
-        <w:t>How These Features Came to Be: The Iterative Design Process</w:t>
+        <w:t>PART II — HOW THESE FEATURES CAME TO BE:</w:t>
+      </w:r>
+    </w:p>
+    <w:p>
+      <w:pPr>
+        <w:spacing w:before="800" w:after="80"/>
+        <w:jc w:val="center"/>
+      </w:pPr>
+      <w:r>
+        <w:rPr>
+          <w:rFonts w:ascii="Palatino" w:hAnsi="Palatino"/>
+          <w:b/>
+          <w:i w:val="0"/>
+          <w:color w:val="8C2F2B"/>
+          <w:sz w:val="52"/>
+        </w:rPr>
+        <w:t>THE ITERATIVE DESIGN PROCESS</w:t>
       </w:r>
     </w:p>
     <w:p>
@@ -1356,7 +1368,7 @@
           <w:b w:val="0"/>
           <w:i w:val="0"/>
         </w:rPr>
-        <w:t xml:space="preserve"> First the bare dictionary shading; then each diagnostic layer arrived only as its data was verified — spelling underlines when the open-licensed syllable rules were banked; provisional dashing when the tier system hardened; particle-agreement marks only after the classical tables were calibrated against the full corpus. That calibration exercise itself became scholarship: the “failures” turned out to be precisely the famous da-drag stems, and what began as a bug list became a documented exception class. From this a design law emerged that now governs everything: </w:t>
+        <w:t xml:space="preserve"> First the bare dictionary shading; then each diagnostic layer arrived only as its data was verified — spelling underlines when the open-licensed syllable rules were banked; provisional dashing when the tier system hardened; particle-agreement marks only after the classical tables were calibrated against the full corpus. That calibration exercise itself became scholarship: the "failures" turned out to be precisely the famous da-drag stems, and what began as a bug list became a documented exception class. From this a design law emerged that now governs everything: </w:t>
       </w:r>
       <w:r>
         <w:rPr>
@@ -1448,7 +1460,7 @@
           <w:b w:val="0"/>
           <w:i w:val="0"/>
         </w:rPr>
-        <w:t>, in the reference implementation's own page-rotation mathematics, now documented for its maintainers while our port offers the correction as a labeled option. The text decoder was not approximated but ported to the letter, down to the floating-point behavior of the original's numerical libraries, until output matched byte for byte. The word-position feature then came almost free — the canonical decoder computes word coordinates internally and its own application discards them; ours keeps them, and proves them against the original exactly.</w:t>
+        <w:t>, in the reference implementation's own page-rotation mathematics, now documented for its maintainers while our port offers the correction as a labeled option. The text decoder was not approximated but ported to the letter, down to the floating- point behavior of the original's numerical libraries, until output matched byte for byte. The word-position feature then came almost free — the canonical decoder computes word coordinates internally and its own application discards them; ours keeps them, and proves them against the original exactly.</w:t>
       </w:r>
     </w:p>
     <w:p>
@@ -1466,7 +1478,7 @@
           <w:b w:val="0"/>
           <w:i w:val="0"/>
         </w:rPr>
-        <w:t xml:space="preserve"> A question — “could we integrate Hypercontext?” — led to the discovery, inside the program's own tutorial, that Hypercontext was never merely a reader: it was the alignment-authoring tool whose files fed the first dictionary building. Its reading half already existed in this tool; its authoring half became the Align pane. A second question — “can you find ACE?” — led through old browser bookmarks to a vanished website to the original author's published source code, Apache-licensed, containing the entire input-center software ecosystem: the scan-beside-editor workstation, the cursor-following scan, the double-keying discipline. Reading that source showed its cursor-following was an approximation; the rebuilt Input pane keeps the workflow the input centers were trained on and upgrades the following with true word coordinates. Institutional memory, recovered and put back to work.</w:t>
+        <w:t xml:space="preserve"> A question — "could we integrate Hypercontext?" — led to the discovery, inside the program's own tutorial, that Hypercontext was never merely a reader: it was the alignment-authoring tool whose files fed the first dictionary building. Its reading half already existed in this tool; its authoring half became the Align pane. A second question — "can you find ACE?" — led through old browser bookmarks to a vanished website to the original author's published source code, Apache- licensed, containing the entire input-center software ecosystem: the scan-beside-editor workstation, the cursor-following scan, the double-keying discipline. Reading that source showed its cursor-following was an approximation; the rebuilt Input pane keeps the workflow the input centers were trained on and upgrades the following with true word coordinates. Institutional memory, recovered and put back to work.</w:t>
       </w:r>
     </w:p>
     <w:p>
@@ -1492,7 +1504,7 @@
           <w:b w:val="0"/>
           <w:i/>
         </w:rPr>
-        <w:t>SKABS 'DIR is pronounced “kamdir”</w:t>
+        <w:t>SKABS 'DIR is pronounced "kamdir"</w:t>
       </w:r>
       <w:r>
         <w:rPr>
@@ -1587,56 +1599,18 @@
     </w:p>
     <w:p>
       <w:pPr>
-        <w:spacing w:before="360" w:after="360"/>
+        <w:spacing w:before="800" w:after="80"/>
         <w:jc w:val="center"/>
       </w:pPr>
       <w:r>
         <w:rPr>
           <w:rFonts w:ascii="Palatino" w:hAnsi="Palatino"/>
-          <w:b w:val="0"/>
-          <w:i w:val="0"/>
-          <w:color w:val="C9B992"/>
-          <w:sz w:val="18"/>
-        </w:rPr>
-        <w:t xml:space="preserve">──────────────────────  </w:t>
-      </w:r>
-      <w:r>
-        <w:rPr>
-          <w:rFonts w:ascii="Palatino" w:hAnsi="Palatino"/>
-          <w:b w:val="0"/>
-          <w:i w:val="0"/>
-          <w:color w:val="9A7A33"/>
-          <w:sz w:val="18"/>
-        </w:rPr>
-        <w:t>❖</w:t>
-      </w:r>
-      <w:r>
-        <w:rPr>
-          <w:rFonts w:ascii="Palatino" w:hAnsi="Palatino"/>
-          <w:b w:val="0"/>
-          <w:i w:val="0"/>
-          <w:color w:val="C9B992"/>
-          <w:sz w:val="18"/>
-        </w:rPr>
-        <w:t xml:space="preserve">  ──────────────────────</w:t>
-      </w:r>
-    </w:p>
-    <w:p>
-      <w:pPr>
-        <w:spacing w:before="120" w:after="80"/>
-        <w:jc w:val="center"/>
-      </w:pPr>
-      <w:r>
-        <w:rPr>
-          <w:rFonts w:ascii="Helvetica Neue" w:hAnsi="Helvetica Neue"/>
           <w:b/>
           <w:i w:val="0"/>
-          <w:color w:val="9A7A33"/>
-          <w:sz w:val="16"/>
-          <w:caps w:val="1"/>
-          <w:spacing w:val="28"/>
+          <w:color w:val="8C2F2B"/>
+          <w:sz w:val="52"/>
         </w:rPr>
-        <w:t>Part III</w:t>
+        <w:t>PART III — THE ROAD AHEAD</w:t>
       </w:r>
     </w:p>
     <w:p>
@@ -1652,22 +1626,6 @@
           <w:i w:val="0"/>
           <w:color w:val="2B2118"/>
           <w:sz w:val="32"/>
-        </w:rPr>
-        <w:t>The Road Ahead</w:t>
-      </w:r>
-    </w:p>
-    <w:p>
-      <w:pPr>
-        <w:keepNext/>
-        <w:spacing w:before="240" w:after="80"/>
-      </w:pPr>
-      <w:r>
-        <w:rPr>
-          <w:rFonts w:ascii="Palatino" w:hAnsi="Palatino"/>
-          <w:b/>
-          <w:i w:val="0"/>
-          <w:color w:val="2B2118"/>
-          <w:sz w:val="24"/>
         </w:rPr>
         <w:t>What awaits review and decision (the leadership's part)</w:t>
       </w:r>
@@ -1700,7 +1658,7 @@
           <w:b w:val="0"/>
           <w:i w:val="0"/>
         </w:rPr>
-        <w:t xml:space="preserve"> — 205 derived forms applying Geshe Michael's stated rule, each mechanically aligned and verified never to contradict an attested pronunciation. A one-sitting review sheet is prepared; his approval promotes the class from “derived” to “approved.”</w:t>
+        <w:t xml:space="preserve"> — 205 derived forms applying Geshe Michael's stated rule, each mechanically aligned and verified never to contradict an attested pronunciation. A one-sitting review sheet is prepared; his approval promotes the class from "derived" to "approved."</w:t>
       </w:r>
     </w:p>
     <w:p>
@@ -1830,7 +1788,8 @@
     <w:p>
       <w:pPr>
         <w:keepNext/>
-        <w:spacing w:before="240" w:after="80"/>
+        <w:spacing w:before="40" w:after="240"/>
+        <w:jc w:val="center"/>
       </w:pPr>
       <w:r>
         <w:rPr>
@@ -1838,9 +1797,9 @@
           <w:b/>
           <w:i w:val="0"/>
           <w:color w:val="2B2118"/>
-          <w:sz w:val="24"/>
+          <w:sz w:val="32"/>
         </w:rPr>
-        <w:t>What should be built next (recommendations)</w:t>
+        <w:t>What should be built next (my recommendations)</w:t>
       </w:r>
     </w:p>
     <w:p>
@@ -1918,7 +1877,7 @@
           <w:b w:val="0"/>
           <w:i w:val="0"/>
         </w:rPr>
-        <w:t xml:space="preserve"> — unifying the draft-checking instruments into the side-by-side reviewer's pane the roadmap envisioned, so that a senior translator reviewing a junior's work sees provisional-tier reliance and register warnings at a glance.</w:t>
+        <w:t xml:space="preserve"> — unifying the draft-checking instruments into the side-by-side reviewer's pane the roadmap envisioned, so that a senior translator reviewing a junior's work sees provisional -tier reliance and register warnings at a glance.</w:t>
       </w:r>
     </w:p>
     <w:p>
@@ -1949,7 +1908,7 @@
           <w:b w:val="0"/>
           <w:i w:val="0"/>
         </w:rPr>
-        <w:t xml:space="preserve"> The Align pane accumulates expert word pairs; a view over the accumulated harvest plus the corpus would let any translator ask “how has this whole phrase been rendered before?” — the beginnings of a Project translation memory, built entirely from attested work.</w:t>
+        <w:t xml:space="preserve"> The Align pane accumulates expert word pairs; a view over the accumulated harvest plus the corpus would let any translator ask "how has this whole phrase been rendered before?" — the beginnings of a Project translation memory, built entirely from attested work.</w:t>
       </w:r>
     </w:p>
     <w:p>
@@ -2110,7 +2069,8 @@
     <w:p>
       <w:pPr>
         <w:keepNext/>
-        <w:spacing w:before="240" w:after="80"/>
+        <w:spacing w:before="40" w:after="240"/>
+        <w:jc w:val="center"/>
       </w:pPr>
       <w:r>
         <w:rPr>
@@ -2118,7 +2078,7 @@
           <w:b/>
           <w:i w:val="0"/>
           <w:color w:val="2B2118"/>
-          <w:sz w:val="24"/>
+          <w:sz w:val="32"/>
         </w:rPr>
         <w:t>The larger vision</w:t>
       </w:r>

</xml_diff>

<commit_message>
Propose from the Lookup card — the channel's last loose end closed
Every dictionary lookup now ends with "propose to the authority…":
kind picker, proposed value, filed through the shared channel with
the lookup context as evidence (honorific proposals route the
ordinary counterpart into the register's secondary column, as
everywhere). The picker logic lives in a file-scope proposeTermDialog
so any future card can reuse it. Selftest check 44 pins the action's
presence; the leadership overview now counts thirty-eight batteries
including the forty-four-check self-test.

38/38 suites green; launch verified.

Co-Authored-By: Claude Fable 5 <noreply@anthropic.com>
</commit_message>
<xml_diff>
--- a/docs/APP_FUNCTIONS_AND_DESIGN.docx
+++ b/docs/APP_FUNCTIONS_AND_DESIGN.docx
@@ -1258,7 +1258,7 @@
           <w:b/>
           <w:i w:val="0"/>
         </w:rPr>
-        <w:t>Thirty-seven automated test batteries</w:t>
+        <w:t>Thirty-eight automated test batteries</w:t>
       </w:r>
       <w:r>
         <w:rPr>
@@ -1266,7 +1266,7 @@
           <w:b w:val="0"/>
           <w:i w:val="0"/>
         </w:rPr>
-        <w:t xml:space="preserve"> run before any change ships.</w:t>
+        <w:t xml:space="preserve"> run before any change ships — including the application's own self-test: forty-four checks that construct the real panes against the real dictionary and prove their behavior, from clause-splitting to the approval queue.</w:t>
       </w:r>
     </w:p>
     <w:p>

</xml_diff>